<commit_message>
fixed docx resume medis klaim
</commit_message>
<xml_diff>
--- a/public/doc/klaim/resumemedis/rawatdarurat.docx
+++ b/public/doc/klaim/resumemedis/rawatdarurat.docx
@@ -11,7 +11,8 @@
       </w:tblPr>
       <w:tblGrid>
         <w:gridCol w:w="1285"/>
-        <w:gridCol w:w="283"/>
+        <w:gridCol w:w="236"/>
+        <w:gridCol w:w="47"/>
         <w:gridCol w:w="284"/>
         <w:gridCol w:w="567"/>
         <w:gridCol w:w="310"/>
@@ -20,11 +21,10 @@
         <w:gridCol w:w="425"/>
         <w:gridCol w:w="284"/>
         <w:gridCol w:w="283"/>
-        <w:gridCol w:w="567"/>
-        <w:gridCol w:w="567"/>
-        <w:gridCol w:w="142"/>
-        <w:gridCol w:w="142"/>
-        <w:gridCol w:w="62"/>
+        <w:gridCol w:w="284"/>
+        <w:gridCol w:w="283"/>
+        <w:gridCol w:w="709"/>
+        <w:gridCol w:w="204"/>
         <w:gridCol w:w="127"/>
         <w:gridCol w:w="236"/>
         <w:gridCol w:w="425"/>
@@ -110,13 +110,7 @@
                                     <w:jc w:val="center"/>
                                   </w:pPr>
                                   <w:r>
-                                    <w:t>${</w:t>
-                                  </w:r>
-                                  <w:r>
-                                    <w:t>LOGO_RS</w:t>
-                                  </w:r>
-                                  <w:r>
-                                    <w:t>}</w:t>
+                                    <w:t>${LOGO_RS}</w:t>
                                   </w:r>
                                 </w:p>
                               </w:txbxContent>
@@ -153,13 +147,7 @@
                               <w:jc w:val="center"/>
                             </w:pPr>
                             <w:r>
-                              <w:t>${</w:t>
-                            </w:r>
-                            <w:r>
-                              <w:t>LOGO_RS</w:t>
-                            </w:r>
-                            <w:r>
-                              <w:t>}</w:t>
+                              <w:t>${LOGO_RS}</w:t>
                             </w:r>
                           </w:p>
                         </w:txbxContent>
@@ -248,7 +236,7 @@
         <w:tc>
           <w:tcPr>
             <w:tcW w:w="4545" w:type="dxa"/>
-            <w:gridSpan w:val="11"/>
+            <w:gridSpan w:val="13"/>
             <w:tcBorders>
               <w:top w:val="single" w:sz="6" w:space="0" w:color="auto"/>
               <w:left w:val="single" w:sz="6" w:space="0" w:color="auto"/>
@@ -307,7 +295,7 @@
         <w:tc>
           <w:tcPr>
             <w:tcW w:w="2241" w:type="dxa"/>
-            <w:gridSpan w:val="8"/>
+            <w:gridSpan w:val="6"/>
             <w:tcBorders>
               <w:top w:val="single" w:sz="6" w:space="0" w:color="auto"/>
               <w:left w:val="single" w:sz="6" w:space="0" w:color="auto"/>
@@ -475,7 +463,7 @@
         <w:tc>
           <w:tcPr>
             <w:tcW w:w="4545" w:type="dxa"/>
-            <w:gridSpan w:val="11"/>
+            <w:gridSpan w:val="13"/>
             <w:tcBorders>
               <w:left w:val="single" w:sz="6" w:space="0" w:color="auto"/>
               <w:bottom w:val="single" w:sz="6" w:space="0" w:color="auto"/>
@@ -509,7 +497,7 @@
         <w:tc>
           <w:tcPr>
             <w:tcW w:w="2241" w:type="dxa"/>
-            <w:gridSpan w:val="8"/>
+            <w:gridSpan w:val="6"/>
             <w:tcBorders>
               <w:left w:val="single" w:sz="6" w:space="0" w:color="auto"/>
               <w:bottom w:val="single" w:sz="6" w:space="0" w:color="auto"/>
@@ -599,7 +587,7 @@
         <w:tc>
           <w:tcPr>
             <w:tcW w:w="2419" w:type="dxa"/>
-            <w:gridSpan w:val="4"/>
+            <w:gridSpan w:val="5"/>
             <w:tcBorders>
               <w:top w:val="single" w:sz="6" w:space="0" w:color="auto"/>
               <w:left w:val="single" w:sz="6" w:space="0" w:color="auto"/>
@@ -658,7 +646,7 @@
         <w:tc>
           <w:tcPr>
             <w:tcW w:w="2126" w:type="dxa"/>
-            <w:gridSpan w:val="7"/>
+            <w:gridSpan w:val="8"/>
             <w:tcBorders>
               <w:top w:val="single" w:sz="6" w:space="0" w:color="auto"/>
               <w:left w:val="single" w:sz="6" w:space="0" w:color="auto"/>
@@ -722,7 +710,7 @@
         <w:tc>
           <w:tcPr>
             <w:tcW w:w="6625" w:type="dxa"/>
-            <w:gridSpan w:val="12"/>
+            <w:gridSpan w:val="10"/>
             <w:tcBorders>
               <w:top w:val="single" w:sz="6" w:space="0" w:color="auto"/>
               <w:left w:val="single" w:sz="6" w:space="0" w:color="auto"/>
@@ -782,7 +770,7 @@
         <w:tc>
           <w:tcPr>
             <w:tcW w:w="2419" w:type="dxa"/>
-            <w:gridSpan w:val="4"/>
+            <w:gridSpan w:val="5"/>
             <w:tcBorders>
               <w:left w:val="single" w:sz="6" w:space="0" w:color="auto"/>
               <w:bottom w:val="single" w:sz="6" w:space="0" w:color="auto"/>
@@ -820,7 +808,7 @@
         <w:tc>
           <w:tcPr>
             <w:tcW w:w="2126" w:type="dxa"/>
-            <w:gridSpan w:val="7"/>
+            <w:gridSpan w:val="8"/>
             <w:tcBorders>
               <w:left w:val="single" w:sz="6" w:space="0" w:color="auto"/>
               <w:bottom w:val="single" w:sz="6" w:space="0" w:color="auto"/>
@@ -853,7 +841,7 @@
         <w:tc>
           <w:tcPr>
             <w:tcW w:w="6625" w:type="dxa"/>
-            <w:gridSpan w:val="12"/>
+            <w:gridSpan w:val="10"/>
             <w:tcBorders>
               <w:left w:val="single" w:sz="6" w:space="0" w:color="auto"/>
               <w:bottom w:val="single" w:sz="6" w:space="0" w:color="auto"/>
@@ -895,7 +883,7 @@
         <w:tc>
           <w:tcPr>
             <w:tcW w:w="4545" w:type="dxa"/>
-            <w:gridSpan w:val="11"/>
+            <w:gridSpan w:val="13"/>
             <w:tcBorders>
               <w:top w:val="single" w:sz="6" w:space="0" w:color="auto"/>
               <w:left w:val="single" w:sz="6" w:space="0" w:color="auto"/>
@@ -965,7 +953,7 @@
         <w:tc>
           <w:tcPr>
             <w:tcW w:w="6625" w:type="dxa"/>
-            <w:gridSpan w:val="12"/>
+            <w:gridSpan w:val="10"/>
             <w:tcBorders>
               <w:top w:val="single" w:sz="6" w:space="0" w:color="auto"/>
               <w:left w:val="single" w:sz="6" w:space="0" w:color="auto"/>
@@ -1029,7 +1017,7 @@
         <w:tc>
           <w:tcPr>
             <w:tcW w:w="4545" w:type="dxa"/>
-            <w:gridSpan w:val="11"/>
+            <w:gridSpan w:val="13"/>
             <w:tcBorders>
               <w:left w:val="single" w:sz="6" w:space="0" w:color="auto"/>
               <w:bottom w:val="single" w:sz="6" w:space="0" w:color="auto"/>
@@ -1068,7 +1056,7 @@
         <w:tc>
           <w:tcPr>
             <w:tcW w:w="6625" w:type="dxa"/>
-            <w:gridSpan w:val="12"/>
+            <w:gridSpan w:val="10"/>
             <w:tcBorders>
               <w:left w:val="single" w:sz="6" w:space="0" w:color="auto"/>
               <w:bottom w:val="single" w:sz="6" w:space="0" w:color="auto"/>
@@ -1104,7 +1092,7 @@
         <w:tc>
           <w:tcPr>
             <w:tcW w:w="1852" w:type="dxa"/>
-            <w:gridSpan w:val="3"/>
+            <w:gridSpan w:val="4"/>
             <w:vMerge w:val="restart"/>
             <w:tcBorders>
               <w:left w:val="single" w:sz="5" w:space="0" w:color="000000"/>
@@ -1168,7 +1156,7 @@
         <w:tc>
           <w:tcPr>
             <w:tcW w:w="9318" w:type="dxa"/>
-            <w:gridSpan w:val="20"/>
+            <w:gridSpan w:val="19"/>
             <w:tcBorders>
               <w:top w:val="single" w:sz="6" w:space="0" w:color="auto"/>
               <w:left w:val="single" w:sz="6" w:space="0" w:color="auto"/>
@@ -1265,7 +1253,7 @@
         <w:tc>
           <w:tcPr>
             <w:tcW w:w="1852" w:type="dxa"/>
-            <w:gridSpan w:val="3"/>
+            <w:gridSpan w:val="4"/>
             <w:vMerge/>
             <w:tcBorders>
               <w:left w:val="single" w:sz="5" w:space="0" w:color="000000"/>
@@ -1291,7 +1279,7 @@
         <w:tc>
           <w:tcPr>
             <w:tcW w:w="9318" w:type="dxa"/>
-            <w:gridSpan w:val="20"/>
+            <w:gridSpan w:val="19"/>
             <w:tcBorders>
               <w:left w:val="single" w:sz="6" w:space="0" w:color="auto"/>
               <w:bottom w:val="single" w:sz="6" w:space="0" w:color="auto"/>
@@ -1327,7 +1315,7 @@
         <w:tc>
           <w:tcPr>
             <w:tcW w:w="1852" w:type="dxa"/>
-            <w:gridSpan w:val="3"/>
+            <w:gridSpan w:val="4"/>
             <w:vMerge/>
             <w:tcBorders>
               <w:left w:val="single" w:sz="5" w:space="0" w:color="000000"/>
@@ -1353,7 +1341,7 @@
         <w:tc>
           <w:tcPr>
             <w:tcW w:w="9318" w:type="dxa"/>
-            <w:gridSpan w:val="20"/>
+            <w:gridSpan w:val="19"/>
             <w:tcBorders>
               <w:top w:val="single" w:sz="6" w:space="0" w:color="auto"/>
               <w:left w:val="single" w:sz="6" w:space="0" w:color="auto"/>
@@ -1433,7 +1421,7 @@
         <w:tc>
           <w:tcPr>
             <w:tcW w:w="1852" w:type="dxa"/>
-            <w:gridSpan w:val="3"/>
+            <w:gridSpan w:val="4"/>
             <w:vMerge/>
             <w:tcBorders>
               <w:left w:val="single" w:sz="5" w:space="0" w:color="000000"/>
@@ -1460,7 +1448,7 @@
         <w:tc>
           <w:tcPr>
             <w:tcW w:w="9318" w:type="dxa"/>
-            <w:gridSpan w:val="20"/>
+            <w:gridSpan w:val="19"/>
             <w:tcBorders>
               <w:left w:val="single" w:sz="6" w:space="0" w:color="auto"/>
               <w:bottom w:val="single" w:sz="6" w:space="0" w:color="auto"/>
@@ -1497,7 +1485,7 @@
         <w:tc>
           <w:tcPr>
             <w:tcW w:w="1852" w:type="dxa"/>
-            <w:gridSpan w:val="3"/>
+            <w:gridSpan w:val="4"/>
             <w:tcBorders>
               <w:top w:val="single" w:sz="5" w:space="0" w:color="000000"/>
               <w:left w:val="single" w:sz="5" w:space="0" w:color="000000"/>
@@ -1580,7 +1568,7 @@
         <w:tc>
           <w:tcPr>
             <w:tcW w:w="9318" w:type="dxa"/>
-            <w:gridSpan w:val="20"/>
+            <w:gridSpan w:val="19"/>
             <w:tcBorders>
               <w:top w:val="single" w:sz="6" w:space="0" w:color="auto"/>
               <w:left w:val="single" w:sz="5" w:space="0" w:color="000000"/>
@@ -1616,7 +1604,7 @@
         <w:tc>
           <w:tcPr>
             <w:tcW w:w="1852" w:type="dxa"/>
-            <w:gridSpan w:val="3"/>
+            <w:gridSpan w:val="4"/>
             <w:tcBorders>
               <w:top w:val="single" w:sz="5" w:space="0" w:color="000000"/>
               <w:left w:val="single" w:sz="5" w:space="0" w:color="000000"/>
@@ -1681,7 +1669,7 @@
         <w:tc>
           <w:tcPr>
             <w:tcW w:w="9318" w:type="dxa"/>
-            <w:gridSpan w:val="20"/>
+            <w:gridSpan w:val="19"/>
             <w:tcBorders>
               <w:top w:val="single" w:sz="5" w:space="0" w:color="000000"/>
               <w:left w:val="single" w:sz="5" w:space="0" w:color="000000"/>
@@ -1716,7 +1704,7 @@
         <w:tc>
           <w:tcPr>
             <w:tcW w:w="1852" w:type="dxa"/>
-            <w:gridSpan w:val="3"/>
+            <w:gridSpan w:val="4"/>
             <w:vMerge w:val="restart"/>
             <w:tcBorders>
               <w:top w:val="single" w:sz="5" w:space="0" w:color="000000"/>
@@ -1817,7 +1805,7 @@
         <w:tc>
           <w:tcPr>
             <w:tcW w:w="9318" w:type="dxa"/>
-            <w:gridSpan w:val="20"/>
+            <w:gridSpan w:val="19"/>
             <w:tcBorders>
               <w:top w:val="single" w:sz="6" w:space="0" w:color="auto"/>
               <w:left w:val="single" w:sz="6" w:space="0" w:color="auto"/>
@@ -1866,7 +1854,7 @@
         <w:tc>
           <w:tcPr>
             <w:tcW w:w="1852" w:type="dxa"/>
-            <w:gridSpan w:val="3"/>
+            <w:gridSpan w:val="4"/>
             <w:vMerge/>
             <w:tcBorders>
               <w:left w:val="single" w:sz="5" w:space="0" w:color="000000"/>
@@ -1893,7 +1881,7 @@
         <w:tc>
           <w:tcPr>
             <w:tcW w:w="9318" w:type="dxa"/>
-            <w:gridSpan w:val="20"/>
+            <w:gridSpan w:val="19"/>
             <w:tcBorders>
               <w:left w:val="single" w:sz="6" w:space="0" w:color="auto"/>
               <w:bottom w:val="single" w:sz="6" w:space="0" w:color="auto"/>
@@ -1928,7 +1916,7 @@
         <w:tc>
           <w:tcPr>
             <w:tcW w:w="1852" w:type="dxa"/>
-            <w:gridSpan w:val="3"/>
+            <w:gridSpan w:val="4"/>
             <w:vMerge/>
             <w:tcBorders>
               <w:left w:val="single" w:sz="5" w:space="0" w:color="000000"/>
@@ -1955,7 +1943,7 @@
         <w:tc>
           <w:tcPr>
             <w:tcW w:w="9318" w:type="dxa"/>
-            <w:gridSpan w:val="20"/>
+            <w:gridSpan w:val="19"/>
             <w:tcBorders>
               <w:top w:val="single" w:sz="6" w:space="0" w:color="auto"/>
               <w:left w:val="single" w:sz="6" w:space="0" w:color="auto"/>
@@ -2004,7 +1992,7 @@
         <w:tc>
           <w:tcPr>
             <w:tcW w:w="1852" w:type="dxa"/>
-            <w:gridSpan w:val="3"/>
+            <w:gridSpan w:val="4"/>
             <w:vMerge/>
             <w:tcBorders>
               <w:left w:val="single" w:sz="5" w:space="0" w:color="000000"/>
@@ -2031,7 +2019,7 @@
         <w:tc>
           <w:tcPr>
             <w:tcW w:w="9318" w:type="dxa"/>
-            <w:gridSpan w:val="20"/>
+            <w:gridSpan w:val="19"/>
             <w:tcBorders>
               <w:left w:val="single" w:sz="6" w:space="0" w:color="auto"/>
               <w:bottom w:val="single" w:sz="6" w:space="0" w:color="auto"/>
@@ -2066,7 +2054,7 @@
         <w:tc>
           <w:tcPr>
             <w:tcW w:w="1852" w:type="dxa"/>
-            <w:gridSpan w:val="3"/>
+            <w:gridSpan w:val="4"/>
             <w:vMerge/>
             <w:tcBorders>
               <w:left w:val="single" w:sz="5" w:space="0" w:color="000000"/>
@@ -2093,7 +2081,7 @@
         <w:tc>
           <w:tcPr>
             <w:tcW w:w="9318" w:type="dxa"/>
-            <w:gridSpan w:val="20"/>
+            <w:gridSpan w:val="19"/>
             <w:tcBorders>
               <w:top w:val="single" w:sz="6" w:space="0" w:color="auto"/>
               <w:left w:val="single" w:sz="6" w:space="0" w:color="auto"/>
@@ -2162,7 +2150,7 @@
         <w:tc>
           <w:tcPr>
             <w:tcW w:w="1852" w:type="dxa"/>
-            <w:gridSpan w:val="3"/>
+            <w:gridSpan w:val="4"/>
             <w:vMerge/>
             <w:tcBorders>
               <w:left w:val="single" w:sz="5" w:space="0" w:color="000000"/>
@@ -2190,7 +2178,7 @@
         <w:tc>
           <w:tcPr>
             <w:tcW w:w="9318" w:type="dxa"/>
-            <w:gridSpan w:val="20"/>
+            <w:gridSpan w:val="19"/>
             <w:tcBorders>
               <w:left w:val="single" w:sz="6" w:space="0" w:color="auto"/>
               <w:bottom w:val="single" w:sz="6" w:space="0" w:color="auto"/>
@@ -2540,7 +2528,7 @@
         <w:tc>
           <w:tcPr>
             <w:tcW w:w="1568" w:type="dxa"/>
-            <w:gridSpan w:val="2"/>
+            <w:gridSpan w:val="3"/>
             <w:tcBorders>
               <w:top w:val="single" w:sz="5" w:space="0" w:color="000000"/>
               <w:left w:val="single" w:sz="5" w:space="0" w:color="000000"/>
@@ -2593,7 +2581,7 @@
         <w:tc>
           <w:tcPr>
             <w:tcW w:w="9602" w:type="dxa"/>
-            <w:gridSpan w:val="21"/>
+            <w:gridSpan w:val="20"/>
             <w:tcBorders>
               <w:top w:val="single" w:sz="5" w:space="0" w:color="000000"/>
               <w:left w:val="single" w:sz="5" w:space="0" w:color="000000"/>
@@ -2826,7 +2814,7 @@
         <w:tc>
           <w:tcPr>
             <w:tcW w:w="1568" w:type="dxa"/>
-            <w:gridSpan w:val="2"/>
+            <w:gridSpan w:val="3"/>
             <w:tcBorders>
               <w:top w:val="single" w:sz="5" w:space="0" w:color="000000"/>
               <w:left w:val="single" w:sz="5" w:space="0" w:color="000000"/>
@@ -2879,7 +2867,7 @@
         <w:tc>
           <w:tcPr>
             <w:tcW w:w="9602" w:type="dxa"/>
-            <w:gridSpan w:val="21"/>
+            <w:gridSpan w:val="20"/>
             <w:tcBorders>
               <w:top w:val="single" w:sz="5" w:space="0" w:color="000000"/>
               <w:left w:val="single" w:sz="5" w:space="0" w:color="000000"/>
@@ -3299,8 +3287,7 @@
         </w:trPr>
         <w:tc>
           <w:tcPr>
-            <w:tcW w:w="1568" w:type="dxa"/>
-            <w:gridSpan w:val="2"/>
+            <w:tcW w:w="1285" w:type="dxa"/>
             <w:tcBorders>
               <w:top w:val="single" w:sz="4" w:space="0" w:color="auto"/>
               <w:left w:val="single" w:sz="4" w:space="0" w:color="auto"/>
@@ -3319,7 +3306,8 @@
             <w:r>
               <w:rPr>
                 <w:color w:val="000000"/>
-                <w:sz w:val="15"/>
+                <w:sz w:val="20"/>
+                <w:szCs w:val="20"/>
               </w:rPr>
               <w:t>${CHK_</w:t>
             </w:r>
@@ -3327,16 +3315,10 @@
             <w:r>
               <w:rPr>
                 <w:color w:val="000000"/>
-                <w:sz w:val="15"/>
-              </w:rPr>
-              <w:t>SEMBUH</w:t>
-            </w:r>
-            <w:r>
-              <w:rPr>
-                <w:color w:val="000000"/>
-                <w:sz w:val="15"/>
-              </w:rPr>
-              <w:t>}</w:t>
+                <w:sz w:val="20"/>
+                <w:szCs w:val="20"/>
+              </w:rPr>
+              <w:t>SEMBUH}</w:t>
             </w:r>
             <w:r>
               <w:rPr>
@@ -3366,7 +3348,70 @@
         </w:tc>
         <w:tc>
           <w:tcPr>
-            <w:tcW w:w="1843" w:type="dxa"/>
+            <w:tcW w:w="2126" w:type="dxa"/>
+            <w:gridSpan w:val="8"/>
+            <w:tcBorders>
+              <w:top w:val="single" w:sz="4" w:space="0" w:color="auto"/>
+              <w:left w:val="single" w:sz="4" w:space="0" w:color="auto"/>
+              <w:bottom w:val="single" w:sz="4" w:space="0" w:color="auto"/>
+              <w:right w:val="single" w:sz="4" w:space="0" w:color="auto"/>
+            </w:tcBorders>
+            <w:vAlign w:val="center"/>
+          </w:tcPr>
+          <w:p>
+            <w:r>
+              <w:rPr>
+                <w:color w:val="000000"/>
+                <w:sz w:val="20"/>
+                <w:szCs w:val="20"/>
+              </w:rPr>
+              <w:t>${CHK_BELUM_</w:t>
+            </w:r>
+            <w:proofErr w:type="gramStart"/>
+            <w:r>
+              <w:rPr>
+                <w:color w:val="000000"/>
+                <w:sz w:val="20"/>
+                <w:szCs w:val="20"/>
+              </w:rPr>
+              <w:t>SEMBUH}</w:t>
+            </w:r>
+            <w:r>
+              <w:rPr>
+                <w:color w:val="000000"/>
+                <w:sz w:val="15"/>
+              </w:rPr>
+              <w:t xml:space="preserve">   </w:t>
+            </w:r>
+            <w:proofErr w:type="gramEnd"/>
+            <w:r>
+              <w:rPr>
+                <w:color w:val="000000"/>
+                <w:sz w:val="15"/>
+              </w:rPr>
+              <w:t xml:space="preserve"> </w:t>
+            </w:r>
+            <w:r>
+              <w:rPr>
+                <w:color w:val="000000"/>
+                <w:sz w:val="15"/>
+              </w:rPr>
+              <w:t xml:space="preserve">Belum </w:t>
+            </w:r>
+            <w:proofErr w:type="spellStart"/>
+            <w:r>
+              <w:rPr>
+                <w:color w:val="000000"/>
+                <w:sz w:val="15"/>
+              </w:rPr>
+              <w:t>Sembuh</w:t>
+            </w:r>
+            <w:proofErr w:type="spellEnd"/>
+          </w:p>
+        </w:tc>
+        <w:tc>
+          <w:tcPr>
+            <w:tcW w:w="2047" w:type="dxa"/>
             <w:gridSpan w:val="6"/>
             <w:tcBorders>
               <w:top w:val="single" w:sz="4" w:space="0" w:color="auto"/>
@@ -3380,99 +3425,19 @@
             <w:r>
               <w:rPr>
                 <w:color w:val="000000"/>
-                <w:sz w:val="15"/>
-              </w:rPr>
-              <w:t>${</w:t>
-            </w:r>
-            <w:r>
-              <w:rPr>
-                <w:color w:val="000000"/>
-                <w:sz w:val="15"/>
-              </w:rPr>
-              <w:t>CHK_BELUM_</w:t>
+                <w:sz w:val="20"/>
+                <w:szCs w:val="20"/>
+              </w:rPr>
+              <w:t>${CHK_</w:t>
             </w:r>
             <w:proofErr w:type="gramStart"/>
             <w:r>
               <w:rPr>
                 <w:color w:val="000000"/>
-                <w:sz w:val="15"/>
-              </w:rPr>
-              <w:t>SEMBUH</w:t>
-            </w:r>
-            <w:r>
-              <w:rPr>
-                <w:color w:val="000000"/>
-                <w:sz w:val="15"/>
-              </w:rPr>
-              <w:t>}</w:t>
-            </w:r>
-            <w:r>
-              <w:rPr>
-                <w:color w:val="000000"/>
-                <w:sz w:val="15"/>
-              </w:rPr>
-              <w:t xml:space="preserve">   </w:t>
-            </w:r>
-            <w:proofErr w:type="gramEnd"/>
-            <w:r>
-              <w:rPr>
-                <w:color w:val="000000"/>
-                <w:sz w:val="15"/>
-              </w:rPr>
-              <w:t xml:space="preserve"> </w:t>
-            </w:r>
-            <w:r>
-              <w:rPr>
-                <w:color w:val="000000"/>
-                <w:sz w:val="15"/>
-              </w:rPr>
-              <w:t xml:space="preserve">Belum </w:t>
-            </w:r>
-            <w:proofErr w:type="spellStart"/>
-            <w:r>
-              <w:rPr>
-                <w:color w:val="000000"/>
-                <w:sz w:val="15"/>
-              </w:rPr>
-              <w:t>Sembuh</w:t>
-            </w:r>
-            <w:proofErr w:type="spellEnd"/>
-          </w:p>
-        </w:tc>
-        <w:tc>
-          <w:tcPr>
-            <w:tcW w:w="2047" w:type="dxa"/>
-            <w:gridSpan w:val="7"/>
-            <w:tcBorders>
-              <w:top w:val="single" w:sz="4" w:space="0" w:color="auto"/>
-              <w:left w:val="single" w:sz="4" w:space="0" w:color="auto"/>
-              <w:bottom w:val="single" w:sz="4" w:space="0" w:color="auto"/>
-              <w:right w:val="single" w:sz="4" w:space="0" w:color="auto"/>
-            </w:tcBorders>
-            <w:vAlign w:val="center"/>
-          </w:tcPr>
-          <w:p>
-            <w:r>
-              <w:rPr>
-                <w:color w:val="000000"/>
-                <w:sz w:val="15"/>
-              </w:rPr>
-              <w:t>${CHK_</w:t>
-            </w:r>
-            <w:proofErr w:type="gramStart"/>
-            <w:r>
-              <w:rPr>
-                <w:color w:val="000000"/>
-                <w:sz w:val="15"/>
-              </w:rPr>
-              <w:t>MEMBAIK</w:t>
-            </w:r>
-            <w:r>
-              <w:rPr>
-                <w:color w:val="000000"/>
-                <w:sz w:val="15"/>
-              </w:rPr>
-              <w:t>}</w:t>
+                <w:sz w:val="20"/>
+                <w:szCs w:val="20"/>
+              </w:rPr>
+              <w:t>MEMBAIK}</w:t>
             </w:r>
             <w:r>
               <w:rPr>
@@ -3567,7 +3532,7 @@
         <w:tc>
           <w:tcPr>
             <w:tcW w:w="2729" w:type="dxa"/>
-            <w:gridSpan w:val="5"/>
+            <w:gridSpan w:val="6"/>
             <w:tcBorders>
               <w:top w:val="single" w:sz="4" w:space="0" w:color="auto"/>
               <w:left w:val="single" w:sz="4" w:space="0" w:color="auto"/>
@@ -3586,24 +3551,11 @@
             <w:r>
               <w:rPr>
                 <w:color w:val="000000"/>
-                <w:sz w:val="15"/>
+                <w:sz w:val="20"/>
+                <w:szCs w:val="20"/>
               </w:rPr>
               <w:lastRenderedPageBreak/>
-              <w:t>${CHK_</w:t>
-            </w:r>
-            <w:r>
-              <w:rPr>
-                <w:color w:val="000000"/>
-                <w:sz w:val="15"/>
-              </w:rPr>
-              <w:t>MENINGGAL_KURANG48</w:t>
-            </w:r>
-            <w:r>
-              <w:rPr>
-                <w:color w:val="000000"/>
-                <w:sz w:val="15"/>
-              </w:rPr>
-              <w:t>}</w:t>
+              <w:t>${CHK_MENINGGAL_KURANG48}</w:t>
             </w:r>
             <w:r>
               <w:rPr>
@@ -3633,7 +3585,7 @@
         <w:tc>
           <w:tcPr>
             <w:tcW w:w="2729" w:type="dxa"/>
-            <w:gridSpan w:val="10"/>
+            <w:gridSpan w:val="9"/>
             <w:tcBorders>
               <w:top w:val="single" w:sz="4" w:space="0" w:color="auto"/>
               <w:left w:val="single" w:sz="4" w:space="0" w:color="auto"/>
@@ -3652,23 +3604,10 @@
             <w:r>
               <w:rPr>
                 <w:color w:val="000000"/>
-                <w:sz w:val="15"/>
-              </w:rPr>
-              <w:t>${CHK_MENINGGAL_</w:t>
-            </w:r>
-            <w:r>
-              <w:rPr>
-                <w:color w:val="000000"/>
-                <w:sz w:val="15"/>
-              </w:rPr>
-              <w:t>LEBIH</w:t>
-            </w:r>
-            <w:r>
-              <w:rPr>
-                <w:color w:val="000000"/>
-                <w:sz w:val="15"/>
-              </w:rPr>
-              <w:t>48}</w:t>
+                <w:sz w:val="20"/>
+                <w:szCs w:val="20"/>
+              </w:rPr>
+              <w:t>${CHK_MENINGGAL_LEBIH48}</w:t>
             </w:r>
             <w:r>
               <w:rPr>
@@ -3803,7 +3742,7 @@
         </w:tc>
         <w:tc>
           <w:tcPr>
-            <w:tcW w:w="283" w:type="dxa"/>
+            <w:tcW w:w="236" w:type="dxa"/>
             <w:tcBorders>
               <w:top w:val="single" w:sz="4" w:space="0" w:color="auto"/>
               <w:left w:val="single" w:sz="5" w:space="0" w:color="000000"/>
@@ -3830,8 +3769,8 @@
         </w:tc>
         <w:tc>
           <w:tcPr>
-            <w:tcW w:w="1418" w:type="dxa"/>
-            <w:gridSpan w:val="5"/>
+            <w:tcW w:w="1465" w:type="dxa"/>
+            <w:gridSpan w:val="6"/>
             <w:tcBorders>
               <w:top w:val="single" w:sz="4" w:space="0" w:color="auto"/>
               <w:left w:val="single" w:sz="5" w:space="0" w:color="000000"/>
@@ -3914,7 +3853,7 @@
         <w:tc>
           <w:tcPr>
             <w:tcW w:w="1480" w:type="dxa"/>
-            <w:gridSpan w:val="5"/>
+            <w:gridSpan w:val="4"/>
             <w:tcBorders>
               <w:top w:val="single" w:sz="4" w:space="0" w:color="auto"/>
               <w:left w:val="single" w:sz="5" w:space="0" w:color="000000"/>
@@ -4063,7 +4002,7 @@
         </w:tc>
         <w:tc>
           <w:tcPr>
-            <w:tcW w:w="283" w:type="dxa"/>
+            <w:tcW w:w="236" w:type="dxa"/>
             <w:tcBorders>
               <w:top w:val="single" w:sz="5" w:space="0" w:color="000000"/>
               <w:left w:val="single" w:sz="5" w:space="0" w:color="000000"/>
@@ -4090,8 +4029,8 @@
         </w:tc>
         <w:tc>
           <w:tcPr>
-            <w:tcW w:w="1418" w:type="dxa"/>
-            <w:gridSpan w:val="5"/>
+            <w:tcW w:w="1465" w:type="dxa"/>
+            <w:gridSpan w:val="6"/>
             <w:tcBorders>
               <w:top w:val="single" w:sz="5" w:space="0" w:color="000000"/>
               <w:left w:val="single" w:sz="5" w:space="0" w:color="000000"/>
@@ -4185,7 +4124,7 @@
         <w:tc>
           <w:tcPr>
             <w:tcW w:w="1480" w:type="dxa"/>
-            <w:gridSpan w:val="5"/>
+            <w:gridSpan w:val="4"/>
             <w:tcBorders>
               <w:top w:val="single" w:sz="5" w:space="0" w:color="000000"/>
               <w:left w:val="single" w:sz="5" w:space="0" w:color="000000"/>
@@ -4311,7 +4250,7 @@
         </w:tc>
         <w:tc>
           <w:tcPr>
-            <w:tcW w:w="283" w:type="dxa"/>
+            <w:tcW w:w="236" w:type="dxa"/>
             <w:tcBorders>
               <w:top w:val="single" w:sz="5" w:space="0" w:color="000000"/>
               <w:left w:val="single" w:sz="5" w:space="0" w:color="000000"/>
@@ -4338,7 +4277,7 @@
         </w:tc>
         <w:tc>
           <w:tcPr>
-            <w:tcW w:w="3890" w:type="dxa"/>
+            <w:tcW w:w="3937" w:type="dxa"/>
             <w:gridSpan w:val="13"/>
             <w:tcBorders>
               <w:top w:val="single" w:sz="5" w:space="0" w:color="000000"/>
@@ -4463,7 +4402,7 @@
         </w:tc>
         <w:tc>
           <w:tcPr>
-            <w:tcW w:w="283" w:type="dxa"/>
+            <w:tcW w:w="236" w:type="dxa"/>
             <w:tcBorders>
               <w:top w:val="single" w:sz="5" w:space="0" w:color="000000"/>
               <w:left w:val="single" w:sz="5" w:space="0" w:color="000000"/>
@@ -4490,8 +4429,8 @@
         </w:tc>
         <w:tc>
           <w:tcPr>
-            <w:tcW w:w="3890" w:type="dxa"/>
-            <w:gridSpan w:val="13"/>
+            <w:tcW w:w="9649" w:type="dxa"/>
+            <w:gridSpan w:val="21"/>
             <w:tcBorders>
               <w:top w:val="single" w:sz="5" w:space="0" w:color="000000"/>
               <w:left w:val="single" w:sz="5" w:space="0" w:color="000000"/>
@@ -4514,27 +4453,6 @@
               </w:rPr>
               <w:t>${NYERI}</w:t>
             </w:r>
-          </w:p>
-        </w:tc>
-        <w:tc>
-          <w:tcPr>
-            <w:tcW w:w="5712" w:type="dxa"/>
-            <w:gridSpan w:val="8"/>
-            <w:tcBorders>
-              <w:top w:val="single" w:sz="5" w:space="0" w:color="000000"/>
-              <w:left w:val="single" w:sz="5" w:space="0" w:color="000000"/>
-              <w:bottom w:val="single" w:sz="5" w:space="0" w:color="000000"/>
-              <w:right w:val="single" w:sz="5" w:space="0" w:color="000000"/>
-            </w:tcBorders>
-            <w:vAlign w:val="center"/>
-          </w:tcPr>
-          <w:p>
-            <w:pPr>
-              <w:rPr>
-                <w:color w:val="000000"/>
-                <w:sz w:val="15"/>
-              </w:rPr>
-            </w:pPr>
           </w:p>
         </w:tc>
       </w:tr>
@@ -4620,7 +4538,8 @@
             <w:r>
               <w:rPr>
                 <w:color w:val="000000"/>
-                <w:sz w:val="15"/>
+                <w:sz w:val="20"/>
+                <w:szCs w:val="20"/>
               </w:rPr>
               <w:t>${CHK_DIIJINKAN_PULANG}</w:t>
             </w:r>
@@ -4642,7 +4561,8 @@
               <w:rPr>
                 <w:rFonts w:ascii="Segoe UI Symbol" w:hAnsi="Segoe UI Symbol" w:cs="Segoe UI Symbol"/>
                 <w:color w:val="000000"/>
-                <w:sz w:val="15"/>
+                <w:sz w:val="20"/>
+                <w:szCs w:val="20"/>
               </w:rPr>
               <w:t>☐</w:t>
             </w:r>
@@ -4682,7 +4602,8 @@
               <w:rPr>
                 <w:rFonts w:ascii="Segoe UI Symbol" w:hAnsi="Segoe UI Symbol" w:cs="Segoe UI Symbol"/>
                 <w:color w:val="000000"/>
-                <w:sz w:val="15"/>
+                <w:sz w:val="20"/>
+                <w:szCs w:val="20"/>
               </w:rPr>
               <w:t>☐</w:t>
             </w:r>
@@ -4714,7 +4635,8 @@
               <w:rPr>
                 <w:rFonts w:ascii="Segoe UI Symbol" w:hAnsi="Segoe UI Symbol" w:cs="Segoe UI Symbol"/>
                 <w:color w:val="000000"/>
-                <w:sz w:val="15"/>
+                <w:sz w:val="20"/>
+                <w:szCs w:val="20"/>
               </w:rPr>
               <w:t>☐</w:t>
             </w:r>
@@ -4746,7 +4668,8 @@
               <w:rPr>
                 <w:rFonts w:ascii="Segoe UI Symbol" w:hAnsi="Segoe UI Symbol" w:cs="Segoe UI Symbol"/>
                 <w:color w:val="000000"/>
-                <w:sz w:val="15"/>
+                <w:sz w:val="20"/>
+                <w:szCs w:val="20"/>
               </w:rPr>
               <w:t>☐</w:t>
             </w:r>
@@ -4830,7 +4753,7 @@
         <w:tc>
           <w:tcPr>
             <w:tcW w:w="2844" w:type="dxa"/>
-            <w:gridSpan w:val="6"/>
+            <w:gridSpan w:val="7"/>
             <w:tcBorders>
               <w:top w:val="single" w:sz="5" w:space="0" w:color="000000"/>
               <w:left w:val="single" w:sz="5" w:space="0" w:color="000000"/>
@@ -4947,7 +4870,7 @@
         <w:tc>
           <w:tcPr>
             <w:tcW w:w="992" w:type="dxa"/>
-            <w:gridSpan w:val="5"/>
+            <w:gridSpan w:val="4"/>
             <w:tcBorders>
               <w:top w:val="single" w:sz="5" w:space="0" w:color="000000"/>
               <w:left w:val="single" w:sz="5" w:space="0" w:color="000000"/>
@@ -5083,7 +5006,7 @@
         <w:tc>
           <w:tcPr>
             <w:tcW w:w="2844" w:type="dxa"/>
-            <w:gridSpan w:val="6"/>
+            <w:gridSpan w:val="7"/>
             <w:tcBorders>
               <w:top w:val="single" w:sz="5" w:space="0" w:color="000000"/>
               <w:left w:val="single" w:sz="5" w:space="0" w:color="000000"/>
@@ -5173,7 +5096,7 @@
         <w:tc>
           <w:tcPr>
             <w:tcW w:w="992" w:type="dxa"/>
-            <w:gridSpan w:val="5"/>
+            <w:gridSpan w:val="4"/>
             <w:tcBorders>
               <w:top w:val="single" w:sz="5" w:space="0" w:color="000000"/>
               <w:left w:val="single" w:sz="5" w:space="0" w:color="000000"/>
@@ -5261,8 +5184,7 @@
         </w:trPr>
         <w:tc>
           <w:tcPr>
-            <w:tcW w:w="1568" w:type="dxa"/>
-            <w:gridSpan w:val="2"/>
+            <w:tcW w:w="1285" w:type="dxa"/>
             <w:vMerge w:val="restart"/>
             <w:tcBorders>
               <w:top w:val="single" w:sz="5" w:space="0" w:color="000000"/>
@@ -5332,8 +5254,8 @@
         </w:tc>
         <w:tc>
           <w:tcPr>
-            <w:tcW w:w="2127" w:type="dxa"/>
-            <w:gridSpan w:val="7"/>
+            <w:tcW w:w="1559" w:type="dxa"/>
+            <w:gridSpan w:val="6"/>
             <w:vMerge w:val="restart"/>
             <w:tcBorders>
               <w:top w:val="single" w:sz="5" w:space="0" w:color="000000"/>
@@ -5378,8 +5300,8 @@
         </w:tc>
         <w:tc>
           <w:tcPr>
-            <w:tcW w:w="1417" w:type="dxa"/>
-            <w:gridSpan w:val="3"/>
+            <w:tcW w:w="1418" w:type="dxa"/>
+            <w:gridSpan w:val="5"/>
             <w:tcBorders>
               <w:top w:val="single" w:sz="5" w:space="0" w:color="000000"/>
               <w:left w:val="single" w:sz="5" w:space="0" w:color="000000"/>
@@ -5409,8 +5331,7 @@
         </w:tc>
         <w:tc>
           <w:tcPr>
-            <w:tcW w:w="284" w:type="dxa"/>
-            <w:gridSpan w:val="2"/>
+            <w:tcW w:w="283" w:type="dxa"/>
             <w:tcBorders>
               <w:top w:val="single" w:sz="5" w:space="0" w:color="000000"/>
               <w:left w:val="single" w:sz="5" w:space="0" w:color="000000"/>
@@ -5438,8 +5359,8 @@
         </w:tc>
         <w:tc>
           <w:tcPr>
-            <w:tcW w:w="5774" w:type="dxa"/>
-            <w:gridSpan w:val="9"/>
+            <w:tcW w:w="6625" w:type="dxa"/>
+            <w:gridSpan w:val="10"/>
             <w:tcBorders>
               <w:top w:val="single" w:sz="5" w:space="0" w:color="000000"/>
               <w:left w:val="single" w:sz="5" w:space="0" w:color="000000"/>
@@ -5473,8 +5394,7 @@
         </w:trPr>
         <w:tc>
           <w:tcPr>
-            <w:tcW w:w="1568" w:type="dxa"/>
-            <w:gridSpan w:val="2"/>
+            <w:tcW w:w="1285" w:type="dxa"/>
             <w:vMerge/>
             <w:tcBorders>
               <w:left w:val="single" w:sz="5" w:space="0" w:color="000000"/>
@@ -5499,8 +5419,8 @@
         </w:tc>
         <w:tc>
           <w:tcPr>
-            <w:tcW w:w="2127" w:type="dxa"/>
-            <w:gridSpan w:val="7"/>
+            <w:tcW w:w="1559" w:type="dxa"/>
+            <w:gridSpan w:val="6"/>
             <w:vMerge/>
             <w:tcBorders>
               <w:left w:val="single" w:sz="5" w:space="0" w:color="000000"/>
@@ -5520,8 +5440,8 @@
         </w:tc>
         <w:tc>
           <w:tcPr>
-            <w:tcW w:w="1417" w:type="dxa"/>
-            <w:gridSpan w:val="3"/>
+            <w:tcW w:w="1418" w:type="dxa"/>
+            <w:gridSpan w:val="5"/>
             <w:tcBorders>
               <w:top w:val="single" w:sz="5" w:space="0" w:color="000000"/>
               <w:left w:val="single" w:sz="5" w:space="0" w:color="000000"/>
@@ -5567,8 +5487,7 @@
         </w:tc>
         <w:tc>
           <w:tcPr>
-            <w:tcW w:w="284" w:type="dxa"/>
-            <w:gridSpan w:val="2"/>
+            <w:tcW w:w="283" w:type="dxa"/>
             <w:tcBorders>
               <w:top w:val="single" w:sz="5" w:space="0" w:color="000000"/>
               <w:left w:val="single" w:sz="5" w:space="0" w:color="000000"/>
@@ -5596,8 +5515,8 @@
         </w:tc>
         <w:tc>
           <w:tcPr>
-            <w:tcW w:w="5774" w:type="dxa"/>
-            <w:gridSpan w:val="9"/>
+            <w:tcW w:w="6625" w:type="dxa"/>
+            <w:gridSpan w:val="10"/>
             <w:tcBorders>
               <w:top w:val="single" w:sz="5" w:space="0" w:color="000000"/>
               <w:left w:val="single" w:sz="5" w:space="0" w:color="000000"/>
@@ -5631,8 +5550,7 @@
         </w:trPr>
         <w:tc>
           <w:tcPr>
-            <w:tcW w:w="1568" w:type="dxa"/>
-            <w:gridSpan w:val="2"/>
+            <w:tcW w:w="1285" w:type="dxa"/>
             <w:vMerge/>
             <w:tcBorders>
               <w:left w:val="single" w:sz="5" w:space="0" w:color="000000"/>
@@ -5657,8 +5575,8 @@
         </w:tc>
         <w:tc>
           <w:tcPr>
-            <w:tcW w:w="2127" w:type="dxa"/>
-            <w:gridSpan w:val="7"/>
+            <w:tcW w:w="1559" w:type="dxa"/>
+            <w:gridSpan w:val="6"/>
             <w:vMerge/>
             <w:tcBorders>
               <w:left w:val="single" w:sz="5" w:space="0" w:color="000000"/>
@@ -5678,8 +5596,8 @@
         </w:tc>
         <w:tc>
           <w:tcPr>
-            <w:tcW w:w="1417" w:type="dxa"/>
-            <w:gridSpan w:val="3"/>
+            <w:tcW w:w="1418" w:type="dxa"/>
+            <w:gridSpan w:val="5"/>
             <w:tcBorders>
               <w:top w:val="single" w:sz="5" w:space="0" w:color="000000"/>
               <w:left w:val="single" w:sz="5" w:space="0" w:color="000000"/>
@@ -5709,8 +5627,7 @@
         </w:tc>
         <w:tc>
           <w:tcPr>
-            <w:tcW w:w="284" w:type="dxa"/>
-            <w:gridSpan w:val="2"/>
+            <w:tcW w:w="283" w:type="dxa"/>
             <w:tcBorders>
               <w:top w:val="single" w:sz="5" w:space="0" w:color="000000"/>
               <w:left w:val="single" w:sz="5" w:space="0" w:color="000000"/>
@@ -5738,8 +5655,8 @@
         </w:tc>
         <w:tc>
           <w:tcPr>
-            <w:tcW w:w="5774" w:type="dxa"/>
-            <w:gridSpan w:val="9"/>
+            <w:tcW w:w="6625" w:type="dxa"/>
+            <w:gridSpan w:val="10"/>
             <w:tcBorders>
               <w:top w:val="single" w:sz="5" w:space="0" w:color="000000"/>
               <w:left w:val="single" w:sz="5" w:space="0" w:color="000000"/>
@@ -5773,8 +5690,7 @@
         </w:trPr>
         <w:tc>
           <w:tcPr>
-            <w:tcW w:w="1568" w:type="dxa"/>
-            <w:gridSpan w:val="2"/>
+            <w:tcW w:w="1285" w:type="dxa"/>
             <w:vMerge/>
             <w:tcBorders>
               <w:left w:val="single" w:sz="5" w:space="0" w:color="000000"/>
@@ -5800,8 +5716,8 @@
         </w:tc>
         <w:tc>
           <w:tcPr>
-            <w:tcW w:w="2127" w:type="dxa"/>
-            <w:gridSpan w:val="7"/>
+            <w:tcW w:w="1559" w:type="dxa"/>
+            <w:gridSpan w:val="6"/>
             <w:vMerge/>
             <w:tcBorders>
               <w:left w:val="single" w:sz="5" w:space="0" w:color="000000"/>
@@ -5822,8 +5738,8 @@
         </w:tc>
         <w:tc>
           <w:tcPr>
-            <w:tcW w:w="1417" w:type="dxa"/>
-            <w:gridSpan w:val="3"/>
+            <w:tcW w:w="1418" w:type="dxa"/>
+            <w:gridSpan w:val="5"/>
             <w:tcBorders>
               <w:top w:val="single" w:sz="5" w:space="0" w:color="000000"/>
               <w:left w:val="single" w:sz="5" w:space="0" w:color="000000"/>
@@ -5851,8 +5767,7 @@
         </w:tc>
         <w:tc>
           <w:tcPr>
-            <w:tcW w:w="284" w:type="dxa"/>
-            <w:gridSpan w:val="2"/>
+            <w:tcW w:w="283" w:type="dxa"/>
             <w:tcBorders>
               <w:top w:val="single" w:sz="5" w:space="0" w:color="000000"/>
               <w:left w:val="single" w:sz="5" w:space="0" w:color="000000"/>
@@ -5880,8 +5795,8 @@
         </w:tc>
         <w:tc>
           <w:tcPr>
-            <w:tcW w:w="5774" w:type="dxa"/>
-            <w:gridSpan w:val="9"/>
+            <w:tcW w:w="6625" w:type="dxa"/>
+            <w:gridSpan w:val="10"/>
             <w:tcBorders>
               <w:top w:val="single" w:sz="5" w:space="0" w:color="000000"/>
               <w:left w:val="single" w:sz="5" w:space="0" w:color="000000"/>
@@ -5915,8 +5830,7 @@
         </w:trPr>
         <w:tc>
           <w:tcPr>
-            <w:tcW w:w="1568" w:type="dxa"/>
-            <w:gridSpan w:val="2"/>
+            <w:tcW w:w="1285" w:type="dxa"/>
             <w:tcBorders>
               <w:top w:val="single" w:sz="6" w:space="0" w:color="auto"/>
               <w:left w:val="single" w:sz="6" w:space="0" w:color="auto"/>
@@ -5958,8 +5872,8 @@
         </w:tc>
         <w:tc>
           <w:tcPr>
-            <w:tcW w:w="9602" w:type="dxa"/>
-            <w:gridSpan w:val="21"/>
+            <w:tcW w:w="9885" w:type="dxa"/>
+            <w:gridSpan w:val="22"/>
             <w:tcBorders>
               <w:top w:val="single" w:sz="6" w:space="0" w:color="auto"/>
               <w:left w:val="single" w:sz="6" w:space="0" w:color="000000"/>
@@ -6213,83 +6127,159 @@
             </w:pPr>
             <w:r>
               <w:rPr>
-                <w:rFonts w:cstheme="minorHAnsi"/>
+                <w:color w:val="000000"/>
+                <w:sz w:val="15"/>
+              </w:rPr>
+              <w:t xml:space="preserve">Dokter </w:t>
+            </w:r>
+            <w:proofErr w:type="spellStart"/>
+            <w:r>
+              <w:rPr>
+                <w:color w:val="000000"/>
+                <w:sz w:val="15"/>
+              </w:rPr>
+              <w:t>Penanggung</w:t>
+            </w:r>
+            <w:proofErr w:type="spellEnd"/>
+            <w:r>
+              <w:rPr>
+                <w:color w:val="000000"/>
+                <w:sz w:val="15"/>
+              </w:rPr>
+              <w:t xml:space="preserve"> Jawab </w:t>
+            </w:r>
+            <w:proofErr w:type="spellStart"/>
+            <w:r>
+              <w:rPr>
+                <w:color w:val="000000"/>
+                <w:sz w:val="15"/>
+              </w:rPr>
+              <w:t>Pelayanan</w:t>
+            </w:r>
+            <w:proofErr w:type="spellEnd"/>
+          </w:p>
+          <w:p>
+            <w:pPr>
+              <w:keepNext/>
+              <w:jc w:val="center"/>
+              <w:rPr>
+                <w:color w:val="000000"/>
+                <w:sz w:val="15"/>
+              </w:rPr>
+            </w:pPr>
+          </w:p>
+          <w:p>
+            <w:pPr>
+              <w:keepNext/>
+              <w:jc w:val="center"/>
+              <w:rPr>
+                <w:color w:val="000000"/>
+                <w:sz w:val="15"/>
+              </w:rPr>
+            </w:pPr>
+          </w:p>
+          <w:p>
+            <w:pPr>
+              <w:keepNext/>
+              <w:jc w:val="center"/>
+              <w:rPr>
+                <w:color w:val="000000"/>
+                <w:sz w:val="15"/>
+              </w:rPr>
+            </w:pPr>
+          </w:p>
+          <w:p>
+            <w:pPr>
+              <w:keepNext/>
+              <w:jc w:val="center"/>
+              <w:rPr>
+                <w:color w:val="000000"/>
+                <w:sz w:val="15"/>
+              </w:rPr>
+            </w:pPr>
+          </w:p>
+          <w:p>
+            <w:pPr>
+              <w:keepNext/>
+              <w:jc w:val="center"/>
+              <w:rPr>
+                <w:color w:val="000000"/>
+                <w:sz w:val="15"/>
+              </w:rPr>
+            </w:pPr>
+          </w:p>
+          <w:p>
+            <w:pPr>
+              <w:keepNext/>
+              <w:jc w:val="center"/>
+              <w:rPr>
+                <w:color w:val="000000"/>
+                <w:sz w:val="15"/>
+              </w:rPr>
+            </w:pPr>
+          </w:p>
+          <w:p>
+            <w:pPr>
+              <w:keepNext/>
+              <w:jc w:val="center"/>
+              <w:rPr>
                 <w:bCs/>
-                <w:noProof/>
-              </w:rPr>
-              <mc:AlternateContent>
-                <mc:Choice Requires="wps">
-                  <w:drawing>
-                    <wp:anchor distT="0" distB="0" distL="114300" distR="114300" simplePos="0" relativeHeight="251923456" behindDoc="0" locked="0" layoutInCell="1" allowOverlap="1" wp14:anchorId="4D8FA357" wp14:editId="5543779D">
-                      <wp:simplePos x="0" y="0"/>
-                      <wp:positionH relativeFrom="column">
-                        <wp:posOffset>700405</wp:posOffset>
-                      </wp:positionH>
-                      <wp:positionV relativeFrom="paragraph">
-                        <wp:posOffset>-33020</wp:posOffset>
-                      </wp:positionV>
-                      <wp:extent cx="1969770" cy="961390"/>
-                      <wp:effectExtent l="0" t="0" r="0" b="0"/>
-                      <wp:wrapNone/>
-                      <wp:docPr id="7" name="Text Box 7"/>
-                      <wp:cNvGraphicFramePr/>
-                      <a:graphic xmlns:a="http://schemas.openxmlformats.org/drawingml/2006/main">
-                        <a:graphicData uri="http://schemas.microsoft.com/office/word/2010/wordprocessingShape">
-                          <wps:wsp>
-                            <wps:cNvSpPr txBox="1"/>
-                            <wps:spPr>
-                              <a:xfrm>
-                                <a:off x="0" y="0"/>
-                                <a:ext cx="1969770" cy="961390"/>
-                              </a:xfrm>
-                              <a:prstGeom prst="rect">
-                                <a:avLst/>
-                              </a:prstGeom>
-                              <a:noFill/>
-                              <a:ln w="6350">
-                                <a:noFill/>
-                              </a:ln>
-                            </wps:spPr>
-                            <wps:txbx>
-                              <w:txbxContent>
-                                <w:p>
-                                  <w:pPr>
-                                    <w:jc w:val="center"/>
-                                  </w:pPr>
-                                  <w:r>
-                                    <w:t>${</w:t>
-                                  </w:r>
-                                  <w:r>
-                                    <w:t>TTD_DOKTER</w:t>
-                                  </w:r>
-                                  <w:r>
-                                    <w:t>}</w:t>
-                                  </w:r>
-                                </w:p>
-                              </w:txbxContent>
-                            </wps:txbx>
-                            <wps:bodyPr rot="0" spcFirstLastPara="0" vertOverflow="overflow" horzOverflow="overflow" vert="horz" wrap="square" lIns="91440" tIns="45720" rIns="91440" bIns="45720" numCol="1" spcCol="0" rtlCol="0" fromWordArt="0" anchor="ctr" anchorCtr="0" forceAA="0" compatLnSpc="1">
-                              <a:prstTxWarp prst="textNoShape">
-                                <a:avLst/>
-                              </a:prstTxWarp>
-                              <a:noAutofit/>
-                            </wps:bodyPr>
-                          </wps:wsp>
-                        </a:graphicData>
-                      </a:graphic>
-                      <wp14:sizeRelH relativeFrom="margin">
-                        <wp14:pctWidth>0</wp14:pctWidth>
-                      </wp14:sizeRelH>
-                      <wp14:sizeRelV relativeFrom="margin">
-                        <wp14:pctHeight>0</wp14:pctHeight>
-                      </wp14:sizeRelV>
-                    </wp:anchor>
-                  </w:drawing>
-                </mc:Choice>
-                <mc:Fallback>
-                  <w:pict>
-                    <v:shape w14:anchorId="4D8FA357" id="Text Box 7" o:spid="_x0000_s1027" type="#_x0000_t202" style="position:absolute;left:0;text-align:left;margin-left:55.15pt;margin-top:-2.6pt;width:155.1pt;height:75.7pt;z-index:251923456;visibility:visible;mso-wrap-style:square;mso-width-percent:0;mso-height-percent:0;mso-wrap-distance-left:9pt;mso-wrap-distance-top:0;mso-wrap-distance-right:9pt;mso-wrap-distance-bottom:0;mso-position-horizontal:absolute;mso-position-horizontal-relative:text;mso-position-vertical:absolute;mso-position-vertical-relative:text;mso-width-percent:0;mso-height-percent:0;mso-width-relative:margin;mso-height-relative:margin;v-text-anchor:middle" o:gfxdata="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" filled="f" stroked="f" strokeweight=".5pt">
-                      <v:textbox>
+                <w:color w:val="000000"/>
+                <w:sz w:val="15"/>
+              </w:rPr>
+            </w:pPr>
+            <w:r>
+              <w:rPr>
+                <w:bCs/>
+                <w:color w:val="000000"/>
+              </w:rPr>
+              <w:t>${DOKTER}</w:t>
+            </w:r>
+          </w:p>
+        </w:tc>
+      </w:tr>
+    </w:tbl>
+    <w:p>
+      <w:r>
+        <w:rPr>
+          <w:rFonts w:cstheme="minorHAnsi"/>
+          <w:bCs/>
+          <w:noProof/>
+        </w:rPr>
+        <mc:AlternateContent>
+          <mc:Choice Requires="wps">
+            <w:drawing>
+              <wp:anchor distT="0" distB="0" distL="114300" distR="114300" simplePos="0" relativeHeight="251657216" behindDoc="0" locked="0" layoutInCell="1" allowOverlap="1" wp14:anchorId="4D8FA357" wp14:editId="153186FE">
+                <wp:simplePos x="0" y="0"/>
+                <wp:positionH relativeFrom="column">
+                  <wp:posOffset>4318178</wp:posOffset>
+                </wp:positionH>
+                <wp:positionV relativeFrom="paragraph">
+                  <wp:posOffset>-937564</wp:posOffset>
+                </wp:positionV>
+                <wp:extent cx="2157730" cy="1052830"/>
+                <wp:effectExtent l="0" t="0" r="0" b="0"/>
+                <wp:wrapNone/>
+                <wp:docPr id="7" name="Text Box 7"/>
+                <wp:cNvGraphicFramePr/>
+                <a:graphic xmlns:a="http://schemas.openxmlformats.org/drawingml/2006/main">
+                  <a:graphicData uri="http://schemas.microsoft.com/office/word/2010/wordprocessingShape">
+                    <wps:wsp>
+                      <wps:cNvSpPr txBox="1"/>
+                      <wps:spPr>
+                        <a:xfrm>
+                          <a:off x="0" y="0"/>
+                          <a:ext cx="2157730" cy="1052830"/>
+                        </a:xfrm>
+                        <a:prstGeom prst="rect">
+                          <a:avLst/>
+                        </a:prstGeom>
+                        <a:noFill/>
+                        <a:ln w="6350">
+                          <a:noFill/>
+                        </a:ln>
+                      </wps:spPr>
+                      <wps:txbx>
                         <w:txbxContent>
                           <w:p>
                             <w:pPr>
@@ -6306,127 +6296,52 @@
                             </w:r>
                           </w:p>
                         </w:txbxContent>
-                      </v:textbox>
-                    </v:shape>
-                  </w:pict>
-                </mc:Fallback>
-              </mc:AlternateContent>
-            </w:r>
-            <w:r>
-              <w:rPr>
-                <w:color w:val="000000"/>
-                <w:sz w:val="15"/>
-              </w:rPr>
-              <w:t xml:space="preserve">Dokter </w:t>
-            </w:r>
-            <w:proofErr w:type="spellStart"/>
-            <w:r>
-              <w:rPr>
-                <w:color w:val="000000"/>
-                <w:sz w:val="15"/>
-              </w:rPr>
-              <w:t>Penanggung</w:t>
-            </w:r>
-            <w:proofErr w:type="spellEnd"/>
-            <w:r>
-              <w:rPr>
-                <w:color w:val="000000"/>
-                <w:sz w:val="15"/>
-              </w:rPr>
-              <w:t xml:space="preserve"> Jawab </w:t>
-            </w:r>
-            <w:proofErr w:type="spellStart"/>
-            <w:r>
-              <w:rPr>
-                <w:color w:val="000000"/>
-                <w:sz w:val="15"/>
-              </w:rPr>
-              <w:t>Pelayanan</w:t>
-            </w:r>
-            <w:proofErr w:type="spellEnd"/>
-          </w:p>
-          <w:p>
-            <w:pPr>
-              <w:keepNext/>
-              <w:jc w:val="center"/>
-              <w:rPr>
-                <w:color w:val="000000"/>
-                <w:sz w:val="15"/>
-              </w:rPr>
-            </w:pPr>
-          </w:p>
-          <w:p>
-            <w:pPr>
-              <w:keepNext/>
-              <w:jc w:val="center"/>
-              <w:rPr>
-                <w:color w:val="000000"/>
-                <w:sz w:val="15"/>
-              </w:rPr>
-            </w:pPr>
-          </w:p>
-          <w:p>
-            <w:pPr>
-              <w:keepNext/>
-              <w:jc w:val="center"/>
-              <w:rPr>
-                <w:color w:val="000000"/>
-                <w:sz w:val="15"/>
-              </w:rPr>
-            </w:pPr>
-          </w:p>
-          <w:p>
-            <w:pPr>
-              <w:keepNext/>
-              <w:jc w:val="center"/>
-              <w:rPr>
-                <w:color w:val="000000"/>
-                <w:sz w:val="15"/>
-              </w:rPr>
-            </w:pPr>
-          </w:p>
-          <w:p>
-            <w:pPr>
-              <w:keepNext/>
-              <w:jc w:val="center"/>
-              <w:rPr>
-                <w:color w:val="000000"/>
-                <w:sz w:val="15"/>
-              </w:rPr>
-            </w:pPr>
-          </w:p>
-          <w:p>
-            <w:pPr>
-              <w:keepNext/>
-              <w:jc w:val="center"/>
-              <w:rPr>
-                <w:color w:val="000000"/>
-                <w:sz w:val="15"/>
-              </w:rPr>
-            </w:pPr>
-          </w:p>
-          <w:p>
-            <w:pPr>
-              <w:keepNext/>
-              <w:jc w:val="center"/>
-              <w:rPr>
-                <w:bCs/>
-                <w:color w:val="000000"/>
-                <w:sz w:val="15"/>
-              </w:rPr>
-            </w:pPr>
-            <w:r>
-              <w:rPr>
-                <w:bCs/>
-                <w:color w:val="000000"/>
-              </w:rPr>
-              <w:t>${DOKTER}</w:t>
-            </w:r>
-          </w:p>
-        </w:tc>
-      </w:tr>
-    </w:tbl>
-    <w:p/>
+                      </wps:txbx>
+                      <wps:bodyPr rot="0" spcFirstLastPara="0" vertOverflow="overflow" horzOverflow="overflow" vert="horz" wrap="square" lIns="91440" tIns="45720" rIns="91440" bIns="45720" numCol="1" spcCol="0" rtlCol="0" fromWordArt="0" anchor="ctr" anchorCtr="0" forceAA="0" compatLnSpc="1">
+                        <a:prstTxWarp prst="textNoShape">
+                          <a:avLst/>
+                        </a:prstTxWarp>
+                        <a:noAutofit/>
+                      </wps:bodyPr>
+                    </wps:wsp>
+                  </a:graphicData>
+                </a:graphic>
+                <wp14:sizeRelH relativeFrom="margin">
+                  <wp14:pctWidth>0</wp14:pctWidth>
+                </wp14:sizeRelH>
+                <wp14:sizeRelV relativeFrom="margin">
+                  <wp14:pctHeight>0</wp14:pctHeight>
+                </wp14:sizeRelV>
+              </wp:anchor>
+            </w:drawing>
+          </mc:Choice>
+          <mc:Fallback>
+            <w:pict>
+              <v:shape w14:anchorId="4D8FA357" id="Text Box 7" o:spid="_x0000_s1027" type="#_x0000_t202" style="position:absolute;margin-left:340pt;margin-top:-73.8pt;width:169.9pt;height:82.9pt;z-index:251657216;visibility:visible;mso-wrap-style:square;mso-width-percent:0;mso-height-percent:0;mso-wrap-distance-left:9pt;mso-wrap-distance-top:0;mso-wrap-distance-right:9pt;mso-wrap-distance-bottom:0;mso-position-horizontal:absolute;mso-position-horizontal-relative:text;mso-position-vertical:absolute;mso-position-vertical-relative:text;mso-width-percent:0;mso-height-percent:0;mso-width-relative:margin;mso-height-relative:margin;v-text-anchor:middle" o:gfxdata="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" filled="f" stroked="f" strokeweight=".5pt">
+                <v:textbox>
+                  <w:txbxContent>
+                    <w:p>
+                      <w:pPr>
+                        <w:jc w:val="center"/>
+                      </w:pPr>
+                      <w:r>
+                        <w:t>${</w:t>
+                      </w:r>
+                      <w:r>
+                        <w:t>TTD_DOKTER</w:t>
+                      </w:r>
+                      <w:r>
+                        <w:t>}</w:t>
+                      </w:r>
+                    </w:p>
+                  </w:txbxContent>
+                </v:textbox>
+              </v:shape>
+            </w:pict>
+          </mc:Fallback>
+        </mc:AlternateContent>
+      </w:r>
+    </w:p>
     <w:sectPr>
       <w:footerReference w:type="default" r:id="rId8"/>
       <w:pgSz w:w="12242" w:h="18722" w:code="14"/>

</xml_diff>